<commit_message>
New screenshots and Store images; record the 0.5.0 release
Wider windows so the toolbar is not crowded, sample files that read like real documents (a newsletter in Segoe UI with real tables, a budget with charts, a presentation, trip notes in the dark theme), captured only after each file has opened. The Store logo (300 x 300) and four Store screenshots are in docs/images/store; the README shows the four screenshots.
</commit_message>
<xml_diff>
--- a/docs/images/showcase/Garden newsletter.docx
+++ b/docs/images/showcase/Garden newsletter.docx
@@ -422,51 +422,230 @@
         <w:t xml:space="preserve">Thanks to a grant from the local council, four new 1,000-litre tanks now collect rain from the shed and greenhouse roofs. Last spring we used about 40% mains water; this year we hope to need almost none.</w:t>
       </w:r>
     </w:p>
-    <w:p>
-      <w:r>
-        <w:drawing>
-          <wp:inline distT="0" distB="0" distL="0" distR="0">
-            <wp:extent cx="3429000" cy="1714500"/>
-            <wp:effectExtent t="0" r="0" b="0" l="0"/>
-            <wp:docPr id="1" name="" descr="" title=""/>
-            <wp:cNvGraphicFramePr>
-              <a:graphicFrameLocks xmlns:a="http://schemas.openxmlformats.org/drawingml/2006/main" noChangeAspect="1"/>
-            </wp:cNvGraphicFramePr>
-            <a:graphic xmlns:a="http://schemas.openxmlformats.org/drawingml/2006/main">
-              <a:graphicData uri="http://schemas.openxmlformats.org/drawingml/2006/picture">
-                <pic:pic xmlns:pic="http://schemas.openxmlformats.org/drawingml/2006/picture">
-                  <pic:nvPicPr>
-                    <pic:cNvPr id="0" name="" descr=""/>
-                    <pic:cNvPicPr>
-                      <a:picLocks noChangeAspect="1" noChangeArrowheads="1"/>
-                    </pic:cNvPicPr>
-                  </pic:nvPicPr>
-                  <pic:blipFill>
-                    <a:blip r:embed="rId7" cstate="none"/>
-                    <a:srcRect/>
-                    <a:stretch>
-                      <a:fillRect/>
-                    </a:stretch>
-                  </pic:blipFill>
-                  <pic:spPr bwMode="auto">
-                    <a:xfrm>
-                      <a:off x="0" y="0"/>
-                      <a:ext cx="3429000" cy="1714500"/>
-                    </a:xfrm>
-                    <a:prstGeom prst="rect">
-                      <a:avLst/>
-                    </a:prstGeom>
-                  </pic:spPr>
-                </pic:pic>
-              </a:graphicData>
-            </a:graphic>
-          </wp:inline>
-        </w:drawing>
-      </w:r>
-    </w:p>
-    <w:p>
-      <w:pPr>
-        <w:spacing w:after="200"/>
+    <w:tbl>
+      <w:tblPr>
+        <w:tblW w:type="dxa" w:w="9000"/>
+        <w:tblBorders>
+          <w:top w:val="single" w:color="auto" w:sz="4"/>
+          <w:left w:val="single" w:color="auto" w:sz="4"/>
+          <w:bottom w:val="single" w:color="auto" w:sz="4"/>
+          <w:right w:val="single" w:color="auto" w:sz="4"/>
+          <w:insideH w:val="single" w:color="auto" w:sz="4"/>
+          <w:insideV w:val="single" w:color="auto" w:sz="4"/>
+        </w:tblBorders>
+      </w:tblPr>
+      <w:tblGrid>
+        <w:gridCol w:w="100"/>
+        <w:gridCol w:w="100"/>
+        <w:gridCol w:w="100"/>
+      </w:tblGrid>
+      <w:tr>
+        <w:tc>
+          <w:tcPr>
+            <w:tcW w:type="dxa" w:w="3000"/>
+            <w:shd w:fill="E8F5E9" w:color="auto" w:val="clear"/>
+          </w:tcPr>
+          <w:p>
+            <w:r>
+              <w:rPr>
+                <w:b/>
+                <w:bCs/>
+                <w:sz w:val="22"/>
+                <w:szCs w:val="22"/>
+              </w:rPr>
+              <w:t xml:space="preserve">Month</w:t>
+            </w:r>
+          </w:p>
+        </w:tc>
+        <w:tc>
+          <w:tcPr>
+            <w:tcW w:type="dxa" w:w="3000"/>
+            <w:shd w:fill="E8F5E9" w:color="auto" w:val="clear"/>
+          </w:tcPr>
+          <w:p>
+            <w:r>
+              <w:rPr>
+                <w:b/>
+                <w:bCs/>
+                <w:sz w:val="22"/>
+                <w:szCs w:val="22"/>
+              </w:rPr>
+              <w:t xml:space="preserve">Rain collected</w:t>
+            </w:r>
+          </w:p>
+        </w:tc>
+        <w:tc>
+          <w:tcPr>
+            <w:tcW w:type="dxa" w:w="3000"/>
+            <w:shd w:fill="E8F5E9" w:color="auto" w:val="clear"/>
+          </w:tcPr>
+          <w:p>
+            <w:r>
+              <w:rPr>
+                <w:b/>
+                <w:bCs/>
+                <w:sz w:val="22"/>
+                <w:szCs w:val="22"/>
+              </w:rPr>
+              <w:t xml:space="preserve">Mains water used</w:t>
+            </w:r>
+          </w:p>
+        </w:tc>
+      </w:tr>
+      <w:tr>
+        <w:tc>
+          <w:tcPr>
+            <w:tcW w:type="dxa" w:w="3000"/>
+          </w:tcPr>
+          <w:p>
+            <w:r>
+              <w:rPr>
+                <w:b w:val="false"/>
+                <w:bCs w:val="false"/>
+                <w:sz w:val="22"/>
+                <w:szCs w:val="22"/>
+              </w:rPr>
+              <w:t xml:space="preserve">January</w:t>
+            </w:r>
+          </w:p>
+        </w:tc>
+        <w:tc>
+          <w:tcPr>
+            <w:tcW w:type="dxa" w:w="3000"/>
+          </w:tcPr>
+          <w:p>
+            <w:r>
+              <w:rPr>
+                <w:b w:val="false"/>
+                <w:bCs w:val="false"/>
+                <w:sz w:val="22"/>
+                <w:szCs w:val="22"/>
+              </w:rPr>
+              <w:t xml:space="preserve">2,850 litres</w:t>
+            </w:r>
+          </w:p>
+        </w:tc>
+        <w:tc>
+          <w:tcPr>
+            <w:tcW w:type="dxa" w:w="3000"/>
+          </w:tcPr>
+          <w:p>
+            <w:r>
+              <w:rPr>
+                <w:b w:val="false"/>
+                <w:bCs w:val="false"/>
+                <w:sz w:val="22"/>
+                <w:szCs w:val="22"/>
+              </w:rPr>
+              <w:t xml:space="preserve">None</w:t>
+            </w:r>
+          </w:p>
+        </w:tc>
+      </w:tr>
+      <w:tr>
+        <w:tc>
+          <w:tcPr>
+            <w:tcW w:type="dxa" w:w="3000"/>
+          </w:tcPr>
+          <w:p>
+            <w:r>
+              <w:rPr>
+                <w:b w:val="false"/>
+                <w:bCs w:val="false"/>
+                <w:sz w:val="22"/>
+                <w:szCs w:val="22"/>
+              </w:rPr>
+              <w:t xml:space="preserve">February</w:t>
+            </w:r>
+          </w:p>
+        </w:tc>
+        <w:tc>
+          <w:tcPr>
+            <w:tcW w:type="dxa" w:w="3000"/>
+          </w:tcPr>
+          <w:p>
+            <w:r>
+              <w:rPr>
+                <w:b w:val="false"/>
+                <w:bCs w:val="false"/>
+                <w:sz w:val="22"/>
+                <w:szCs w:val="22"/>
+              </w:rPr>
+              <w:t xml:space="preserve">3,120 litres</w:t>
+            </w:r>
+          </w:p>
+        </w:tc>
+        <w:tc>
+          <w:tcPr>
+            <w:tcW w:type="dxa" w:w="3000"/>
+          </w:tcPr>
+          <w:p>
+            <w:r>
+              <w:rPr>
+                <w:b w:val="false"/>
+                <w:bCs w:val="false"/>
+                <w:sz w:val="22"/>
+                <w:szCs w:val="22"/>
+              </w:rPr>
+              <w:t xml:space="preserve">None</w:t>
+            </w:r>
+          </w:p>
+        </w:tc>
+      </w:tr>
+      <w:tr>
+        <w:tc>
+          <w:tcPr>
+            <w:tcW w:type="dxa" w:w="3000"/>
+          </w:tcPr>
+          <w:p>
+            <w:r>
+              <w:rPr>
+                <w:b w:val="false"/>
+                <w:bCs w:val="false"/>
+                <w:sz w:val="22"/>
+                <w:szCs w:val="22"/>
+              </w:rPr>
+              <w:t xml:space="preserve">March</w:t>
+            </w:r>
+          </w:p>
+        </w:tc>
+        <w:tc>
+          <w:tcPr>
+            <w:tcW w:type="dxa" w:w="3000"/>
+          </w:tcPr>
+          <w:p>
+            <w:r>
+              <w:rPr>
+                <w:b w:val="false"/>
+                <w:bCs w:val="false"/>
+                <w:sz w:val="22"/>
+                <w:szCs w:val="22"/>
+              </w:rPr>
+              <w:t xml:space="preserve">2,460 litres</w:t>
+            </w:r>
+          </w:p>
+        </w:tc>
+        <w:tc>
+          <w:tcPr>
+            <w:tcW w:type="dxa" w:w="3000"/>
+          </w:tcPr>
+          <w:p>
+            <w:r>
+              <w:rPr>
+                <w:b w:val="false"/>
+                <w:bCs w:val="false"/>
+                <w:sz w:val="22"/>
+                <w:szCs w:val="22"/>
+              </w:rPr>
+              <w:t xml:space="preserve">180 litres</w:t>
+            </w:r>
+          </w:p>
+        </w:tc>
+      </w:tr>
+    </w:tbl>
+    <w:p>
+      <w:pPr>
+        <w:spacing w:after="200" w:before="120"/>
       </w:pPr>
       <w:r>
         <w:rPr>
@@ -476,7 +655,7 @@
           <w:sz w:val="20"/>
           <w:szCs w:val="20"/>
         </w:rPr>
-        <w:t xml:space="preserve">Rain collected per month (litres, estimate)</w:t>
+        <w:t xml:space="preserve">Readings from the tank gauges, taken on the last Saturday of each month.</w:t>
       </w:r>
     </w:p>
     <w:p>
@@ -791,7 +970,11 @@
 <file path=word/styles.xml><?xml version="1.0" encoding="utf-8"?>
 <w:styles xmlns:mc="http://schemas.openxmlformats.org/markup-compatibility/2006" xmlns:r="http://schemas.openxmlformats.org/officeDocument/2006/relationships" xmlns:w="http://schemas.openxmlformats.org/wordprocessingml/2006/main" xmlns:w14="http://schemas.microsoft.com/office/word/2010/wordml" xmlns:w15="http://schemas.microsoft.com/office/word/2012/wordml" mc:Ignorable="w14 w15">
   <w:docDefaults>
-    <w:rPrDefault/>
+    <w:rPrDefault>
+      <w:rPr>
+        <w:rFonts w:ascii="Segoe UI" w:cs="Segoe UI" w:eastAsia="Segoe UI" w:hAnsi="Segoe UI"/>
+      </w:rPr>
+    </w:rPrDefault>
     <w:pPrDefault/>
   </w:docDefaults>
   <w:style w:type="paragraph" w:styleId="Title">
@@ -810,9 +993,9 @@
     <w:next w:val="Normal"/>
     <w:qFormat/>
     <w:rPr>
-      <w:color w:val="2E74B5"/>
-      <w:sz w:val="32"/>
-      <w:szCs w:val="32"/>
+      <w:rFonts w:ascii="Segoe UI Semibold" w:cs="Segoe UI Semibold" w:eastAsia="Segoe UI Semibold" w:hAnsi="Segoe UI Semibold"/>
+      <w:sz w:val="30"/>
+      <w:szCs w:val="30"/>
     </w:rPr>
   </w:style>
   <w:style w:type="paragraph" w:styleId="Heading2">

</xml_diff>